<commit_message>
Začetek faze 4. Ustvarjena tabela RentalPriceList
</commit_message>
<xml_diff>
--- a/RentalReport.docx
+++ b/RentalReport.docx
@@ -2,22 +2,868 @@
 <file path=word/document.xml><?xml version="1.0" encoding="utf-8"?>
 <w:document xmlns:wpc="http://schemas.microsoft.com/office/word/2010/wordprocessingCanvas" xmlns:cx="http://schemas.microsoft.com/office/drawing/2014/chartex" xmlns:cx1="http://schemas.microsoft.com/office/drawing/2015/9/8/chartex" xmlns:cx2="http://schemas.microsoft.com/office/drawing/2015/10/21/chartex" xmlns:cx3="http://schemas.microsoft.com/office/drawing/2016/5/9/chartex" xmlns:cx4="http://schemas.microsoft.com/office/drawing/2016/5/10/chartex" xmlns:cx5="http://schemas.microsoft.com/office/drawing/2016/5/11/chartex" xmlns:cx6="http://schemas.microsoft.com/office/drawing/2016/5/12/chartex" xmlns:cx7="http://schemas.microsoft.com/office/drawing/2016/5/13/chartex" xmlns:cx8="http://schemas.microsoft.com/office/drawing/2016/5/14/chartex" xmlns:mc="http://schemas.openxmlformats.org/markup-compatibility/2006" xmlns:aink="http://schemas.microsoft.com/office/drawing/2016/ink" xmlns:am3d="http://schemas.microsoft.com/office/drawing/2017/model3d" xmlns:o="urn:schemas-microsoft-com:office:office" xmlns:oel="http://schemas.microsoft.com/office/2019/extlst" xmlns:r="http://schemas.openxmlformats.org/officeDocument/2006/relationships" xmlns:m="http://schemas.openxmlformats.org/officeDocument/2006/math" xmlns:v="urn:schemas-microsoft-com:vml" xmlns:wp14="http://schemas.microsoft.com/office/word/2010/wordprocessingDrawing" xmlns:wp="http://schemas.openxmlformats.org/drawingml/2006/wordprocessingDrawing" xmlns:w10="urn:schemas-microsoft-com:office:word" xmlns:w="http://schemas.openxmlformats.org/wordprocessingml/2006/main" xmlns:w14="http://schemas.microsoft.com/office/word/2010/wordml" xmlns:w15="http://schemas.microsoft.com/office/word/2012/wordml" xmlns:w16cex="http://schemas.microsoft.com/office/word/2018/wordml/cex" xmlns:w16cid="http://schemas.microsoft.com/office/word/2016/wordml/cid" xmlns:w16="http://schemas.microsoft.com/office/word/2018/wordml" xmlns:w16sdtdh="http://schemas.microsoft.com/office/word/2020/wordml/sdtdatahash" xmlns:w16se="http://schemas.microsoft.com/office/word/2015/wordml/symex" xmlns:wpg="http://schemas.microsoft.com/office/word/2010/wordprocessingGroup" xmlns:wpi="http://schemas.microsoft.com/office/word/2010/wordprocessingInk" xmlns:wne="http://schemas.microsoft.com/office/word/2006/wordml" xmlns:wps="http://schemas.microsoft.com/office/word/2010/wordprocessingShape" mc:Ignorable="w14 w15 w16se w16cid w16 w16cex w16sdtdh wp14">
   <w:body>
-    <w:sdt>
-      <w:sdtPr>
-        <w:id w:val="1550414619"/>
-        <w:placeholder>
-          <w:docPart w:val="DefaultPlaceholder_-1854013440"/>
-        </w:placeholder>
-        <w15:dataBinding w:prefixMappings="xmlns:ns0='urn:microsoft-dynamics-nav/reports/Rental_Report/50400/' " w:xpath="/ns0:NavWordReportXmlPart[1]/ns0:Customer[1]/ns0:PrintDate[1]" w:storeItemID="{7776C64D-EAEC-40BA-B934-66B1CD93BA34}" w16sdtdh:storeItemChecksum="duEvow=="/>
-      </w:sdtPr>
-      <w:sdtContent>
-        <w:p>
+    <w:p>
+      <w:sdt>
+        <w:sdtPr>
+          <w:id w:val="-1937432053"/>
+          <w:placeholder>
+            <w:docPart w:val="DefaultPlaceholder_-1854013440"/>
+          </w:placeholder>
+          <w15:dataBinding w:prefixMappings="xmlns:ns0='urn:microsoft-dynamics-nav/reports/Rental_Report/50400/' " w:xpath="/ns0:NavWordReportXmlPart[1]/ns0:BCReportInformation[1]/ns0:ReportRequest[1]/ns0:CompanyName[1]" w:storeItemID="{7776C64D-EAEC-40BA-B934-66B1CD93BA34}" w16sdtdh:storeItemChecksum="mlf3vw=="/>
+        </w:sdtPr>
+        <w:sdtContent>
+          <w:proofErr w:type="spellStart"/>
           <w:r>
-            <w:t>PrintDate</w:t>
+            <w:t>Company</w:t>
           </w:r>
-        </w:p>
-      </w:sdtContent>
-    </w:sdt>
+          <w:proofErr w:type="spellEnd"/>
+          <w:r>
+            <w:t xml:space="preserve"> Name</w:t>
+          </w:r>
+        </w:sdtContent>
+      </w:sdt>
+      <w:r>
+        <w:t xml:space="preserve">: </w:t>
+      </w:r>
+      <w:sdt>
+        <w:sdtPr>
+          <w:id w:val="1576468064"/>
+          <w:placeholder>
+            <w:docPart w:val="DefaultPlaceholder_-1854013440"/>
+          </w:placeholder>
+          <w15:dataBinding w:prefixMappings="xmlns:ns0='urn:microsoft-dynamics-nav/reports/Rental_Report/50400/' " w:xpath="/ns0:NavWordReportXmlPart[1]/ns0:Labels[1]/ns0:ReportTitle[1]" w:storeItemID="{7776C64D-EAEC-40BA-B934-66B1CD93BA34}" w16sdtdh:storeItemChecksum="mlf3vw=="/>
+        </w:sdtPr>
+        <w:sdtContent>
+          <w:proofErr w:type="spellStart"/>
+          <w:r>
+            <w:t>ReportTitle</w:t>
+          </w:r>
+          <w:proofErr w:type="spellEnd"/>
+        </w:sdtContent>
+      </w:sdt>
+    </w:p>
+    <w:p>
+      <w:pPr>
+        <w:jc w:val="right"/>
+      </w:pPr>
+      <w:sdt>
+        <w:sdtPr>
+          <w:id w:val="591285872"/>
+          <w:placeholder>
+            <w:docPart w:val="DefaultPlaceholder_-1854013440"/>
+          </w:placeholder>
+          <w15:dataBinding w:prefixMappings="xmlns:ns0='urn:microsoft-dynamics-nav/reports/Rental_Report/50400/' " w:xpath="/ns0:NavWordReportXmlPart[1]/ns0:Customer[1]/ns0:CurrentDate[1]" w:storeItemID="{7776C64D-EAEC-40BA-B934-66B1CD93BA34}" w16sdtdh:storeItemChecksum="mlf3vw=="/>
+        </w:sdtPr>
+        <w:sdtContent>
+          <w:proofErr w:type="spellStart"/>
+          <w:r>
+            <w:t>CurrentDate</w:t>
+          </w:r>
+          <w:proofErr w:type="spellEnd"/>
+        </w:sdtContent>
+      </w:sdt>
+    </w:p>
+    <w:p/>
+    <w:p/>
+    <w:tbl>
+      <w:tblPr>
+        <w:tblStyle w:val="Tabelamrea"/>
+        <w:tblW w:w="0" w:type="auto"/>
+        <w:tblLook w:val="04A0" w:firstRow="1" w:lastRow="0" w:firstColumn="1" w:lastColumn="0" w:noHBand="0" w:noVBand="1"/>
+      </w:tblPr>
+      <w:tblGrid>
+        <w:gridCol w:w="4814"/>
+        <w:gridCol w:w="4814"/>
+      </w:tblGrid>
+      <w:tr>
+        <w:tc>
+          <w:tcPr>
+            <w:tcW w:w="4814" w:type="dxa"/>
+          </w:tcPr>
+          <w:p>
+            <w:pPr>
+              <w:rPr>
+                <w:b/>
+                <w:bCs/>
+              </w:rPr>
+            </w:pPr>
+            <w:proofErr w:type="spellStart"/>
+            <w:r>
+              <w:rPr>
+                <w:b/>
+                <w:bCs/>
+              </w:rPr>
+              <w:t>Customer</w:t>
+            </w:r>
+            <w:proofErr w:type="spellEnd"/>
+            <w:r>
+              <w:rPr>
+                <w:b/>
+                <w:bCs/>
+              </w:rPr>
+              <w:t xml:space="preserve"> No.</w:t>
+            </w:r>
+          </w:p>
+        </w:tc>
+        <w:tc>
+          <w:tcPr>
+            <w:tcW w:w="4814" w:type="dxa"/>
+          </w:tcPr>
+          <w:p>
+            <w:pPr>
+              <w:rPr>
+                <w:b/>
+                <w:bCs/>
+              </w:rPr>
+            </w:pPr>
+            <w:proofErr w:type="spellStart"/>
+            <w:r>
+              <w:rPr>
+                <w:b/>
+                <w:bCs/>
+              </w:rPr>
+              <w:t>Customer</w:t>
+            </w:r>
+            <w:proofErr w:type="spellEnd"/>
+            <w:r>
+              <w:rPr>
+                <w:b/>
+                <w:bCs/>
+              </w:rPr>
+              <w:t xml:space="preserve"> Name</w:t>
+            </w:r>
+          </w:p>
+        </w:tc>
+      </w:tr>
+      <w:sdt>
+        <w:sdtPr>
+          <w:id w:val="1753077374"/>
+          <w15:dataBinding w:prefixMappings="xmlns:ns0='urn:microsoft-dynamics-nav/reports/Rental_Report/50400/' " w:xpath="/ns0:NavWordReportXmlPart[1]/ns0:Customer" w:storeItemID="{7776C64D-EAEC-40BA-B934-66B1CD93BA34}"/>
+          <w15:repeatingSection/>
+          <w:alias w:val="#Nav: /Customer"/>
+          <w:tag w:val="#Nav: Rental_Report/50400"/>
+        </w:sdtPr>
+        <w:sdtContent>
+          <w:sdt>
+            <w:sdtPr>
+              <w:id w:val="-533501827"/>
+              <w:placeholder>
+                <w:docPart w:val="DefaultPlaceholder_-1854013435"/>
+              </w:placeholder>
+              <w15:repeatingSectionItem/>
+            </w:sdtPr>
+            <w:sdtContent>
+              <w:tr>
+                <w:sdt>
+                  <w:sdtPr>
+                    <w:id w:val="-1863978043"/>
+                    <w:placeholder>
+                      <w:docPart w:val="DefaultPlaceholder_-1854013440"/>
+                    </w:placeholder>
+                    <w15:dataBinding w:prefixMappings="xmlns:ns0='urn:microsoft-dynamics-nav/reports/Rental_Report/50400/' " w:xpath="/ns0:NavWordReportXmlPart[1]/ns0:Customer[1]/ns0:Customer_No[1]" w:storeItemID="{7776C64D-EAEC-40BA-B934-66B1CD93BA34}" w16sdtdh:storeItemChecksum="mlf3vw=="/>
+                    <w:alias w:val="#Nav: /Customer/Customer_No"/>
+                    <w:tag w:val="#Nav: Rental_Report/50400"/>
+                  </w:sdtPr>
+                  <w:sdtEndPr/>
+                  <w:sdtContent>
+                    <w:tc>
+                      <w:tcPr>
+                        <w:tcW w:w="4814" w:type="dxa"/>
+                      </w:tcPr>
+                      <w:p>
+                        <w:proofErr w:type="spellStart"/>
+                        <w:r>
+                          <w:t>Customer_No</w:t>
+                        </w:r>
+                        <w:proofErr w:type="spellEnd"/>
+                      </w:p>
+                    </w:tc>
+                  </w:sdtContent>
+                </w:sdt>
+                <w:sdt>
+                  <w:sdtPr>
+                    <w:id w:val="1081807519"/>
+                    <w:placeholder>
+                      <w:docPart w:val="DefaultPlaceholder_-1854013440"/>
+                    </w:placeholder>
+                    <w15:dataBinding w:prefixMappings="xmlns:ns0='urn:microsoft-dynamics-nav/reports/Rental_Report/50400/' " w:xpath="/ns0:NavWordReportXmlPart[1]/ns0:Customer[1]/ns0:Name[1]" w:storeItemID="{7776C64D-EAEC-40BA-B934-66B1CD93BA34}" w16sdtdh:storeItemChecksum="mlf3vw=="/>
+                    <w:alias w:val="#Nav: /Customer/Name"/>
+                    <w:tag w:val="#Nav: Rental_Report/50400"/>
+                  </w:sdtPr>
+                  <w:sdtContent>
+                    <w:tc>
+                      <w:tcPr>
+                        <w:tcW w:w="4814" w:type="dxa"/>
+                      </w:tcPr>
+                      <w:p>
+                        <w:r>
+                          <w:t>Name</w:t>
+                        </w:r>
+                      </w:p>
+                    </w:tc>
+                  </w:sdtContent>
+                </w:sdt>
+              </w:tr>
+            </w:sdtContent>
+          </w:sdt>
+        </w:sdtContent>
+      </w:sdt>
+    </w:tbl>
+    <w:p/>
+    <w:tbl>
+      <w:tblPr>
+        <w:tblStyle w:val="Tabelamrea"/>
+        <w:tblW w:w="0" w:type="auto"/>
+        <w:tblLook w:val="04A0" w:firstRow="1" w:lastRow="0" w:firstColumn="1" w:lastColumn="0" w:noHBand="0" w:noVBand="1"/>
+      </w:tblPr>
+      <w:tblGrid>
+        <w:gridCol w:w="1612"/>
+        <w:gridCol w:w="1707"/>
+        <w:gridCol w:w="2590"/>
+        <w:gridCol w:w="2294"/>
+        <w:gridCol w:w="1425"/>
+      </w:tblGrid>
+      <w:tr>
+        <w:tc>
+          <w:tcPr>
+            <w:tcW w:w="1925" w:type="dxa"/>
+          </w:tcPr>
+          <w:p>
+            <w:pPr>
+              <w:rPr>
+                <w:b/>
+                <w:bCs/>
+              </w:rPr>
+            </w:pPr>
+            <w:proofErr w:type="spellStart"/>
+            <w:r>
+              <w:rPr>
+                <w:b/>
+                <w:bCs/>
+              </w:rPr>
+              <w:t>Rental</w:t>
+            </w:r>
+            <w:proofErr w:type="spellEnd"/>
+            <w:r>
+              <w:rPr>
+                <w:b/>
+                <w:bCs/>
+              </w:rPr>
+              <w:t xml:space="preserve"> No.</w:t>
+            </w:r>
+          </w:p>
+        </w:tc>
+        <w:tc>
+          <w:tcPr>
+            <w:tcW w:w="1925" w:type="dxa"/>
+          </w:tcPr>
+          <w:p>
+            <w:pPr>
+              <w:rPr>
+                <w:b/>
+                <w:bCs/>
+              </w:rPr>
+            </w:pPr>
+            <w:proofErr w:type="spellStart"/>
+            <w:r>
+              <w:rPr>
+                <w:b/>
+                <w:bCs/>
+              </w:rPr>
+              <w:t>Rental</w:t>
+            </w:r>
+            <w:proofErr w:type="spellEnd"/>
+            <w:r>
+              <w:rPr>
+                <w:b/>
+                <w:bCs/>
+              </w:rPr>
+              <w:t xml:space="preserve"> Date</w:t>
+            </w:r>
+          </w:p>
+        </w:tc>
+        <w:tc>
+          <w:tcPr>
+            <w:tcW w:w="1926" w:type="dxa"/>
+          </w:tcPr>
+          <w:p>
+            <w:pPr>
+              <w:rPr>
+                <w:b/>
+                <w:bCs/>
+              </w:rPr>
+            </w:pPr>
+            <w:proofErr w:type="spellStart"/>
+            <w:r>
+              <w:rPr>
+                <w:b/>
+                <w:bCs/>
+              </w:rPr>
+              <w:t>Expected</w:t>
+            </w:r>
+            <w:proofErr w:type="spellEnd"/>
+            <w:r>
+              <w:rPr>
+                <w:b/>
+                <w:bCs/>
+              </w:rPr>
+              <w:t xml:space="preserve"> </w:t>
+            </w:r>
+            <w:proofErr w:type="spellStart"/>
+            <w:r>
+              <w:rPr>
+                <w:b/>
+                <w:bCs/>
+              </w:rPr>
+              <w:t>Return</w:t>
+            </w:r>
+            <w:proofErr w:type="spellEnd"/>
+            <w:r>
+              <w:rPr>
+                <w:b/>
+                <w:bCs/>
+              </w:rPr>
+              <w:t xml:space="preserve"> Date</w:t>
+            </w:r>
+          </w:p>
+        </w:tc>
+        <w:tc>
+          <w:tcPr>
+            <w:tcW w:w="1926" w:type="dxa"/>
+          </w:tcPr>
+          <w:p>
+            <w:pPr>
+              <w:rPr>
+                <w:b/>
+                <w:bCs/>
+              </w:rPr>
+            </w:pPr>
+            <w:proofErr w:type="spellStart"/>
+            <w:r>
+              <w:rPr>
+                <w:b/>
+                <w:bCs/>
+              </w:rPr>
+              <w:t>Actual</w:t>
+            </w:r>
+            <w:proofErr w:type="spellEnd"/>
+            <w:r>
+              <w:rPr>
+                <w:b/>
+                <w:bCs/>
+              </w:rPr>
+              <w:t xml:space="preserve"> </w:t>
+            </w:r>
+            <w:proofErr w:type="spellStart"/>
+            <w:r>
+              <w:rPr>
+                <w:b/>
+                <w:bCs/>
+              </w:rPr>
+              <w:t>Return</w:t>
+            </w:r>
+            <w:proofErr w:type="spellEnd"/>
+            <w:r>
+              <w:rPr>
+                <w:b/>
+                <w:bCs/>
+              </w:rPr>
+              <w:t xml:space="preserve"> Date</w:t>
+            </w:r>
+          </w:p>
+        </w:tc>
+        <w:tc>
+          <w:tcPr>
+            <w:tcW w:w="1926" w:type="dxa"/>
+          </w:tcPr>
+          <w:p>
+            <w:pPr>
+              <w:rPr>
+                <w:b/>
+                <w:bCs/>
+              </w:rPr>
+            </w:pPr>
+            <w:r>
+              <w:rPr>
+                <w:b/>
+                <w:bCs/>
+              </w:rPr>
+              <w:t>Status</w:t>
+            </w:r>
+          </w:p>
+        </w:tc>
+      </w:tr>
+      <w:sdt>
+        <w:sdtPr>
+          <w:alias w:val="#Nav: /Customer/Rental_Header"/>
+          <w:tag w:val="#Nav: Rental_Report/50400"/>
+          <w:id w:val="1430843265"/>
+          <w15:dataBinding w:prefixMappings="xmlns:ns0='urn:microsoft-dynamics-nav/reports/Rental_Report/50400/' " w:xpath="/ns0:NavWordReportXmlPart[1]/ns0:Customer[1]/ns0:Rental_Header" w:storeItemID="{7776C64D-EAEC-40BA-B934-66B1CD93BA34}"/>
+          <w15:repeatingSection/>
+        </w:sdtPr>
+        <w:sdtContent>
+          <w:sdt>
+            <w:sdtPr>
+              <w:id w:val="-1657607414"/>
+              <w:placeholder>
+                <w:docPart w:val="DefaultPlaceholder_-1854013435"/>
+              </w:placeholder>
+              <w15:repeatingSectionItem/>
+            </w:sdtPr>
+            <w:sdtContent>
+              <w:tr>
+                <w:sdt>
+                  <w:sdtPr>
+                    <w:alias w:val="#Nav: /Customer/Rental_Header/Rental_No"/>
+                    <w:tag w:val="#Nav: Rental_Report/50400"/>
+                    <w:id w:val="-1418777624"/>
+                    <w:placeholder>
+                      <w:docPart w:val="DefaultPlaceholder_-1854013440"/>
+                    </w:placeholder>
+                    <w15:dataBinding w:prefixMappings="xmlns:ns0='urn:microsoft-dynamics-nav/reports/Rental_Report/50400/' " w:xpath="/ns0:NavWordReportXmlPart[1]/ns0:Customer[1]/ns0:Rental_Header[1]/ns0:Rental_No[1]" w:storeItemID="{7776C64D-EAEC-40BA-B934-66B1CD93BA34}" w16sdtdh:storeItemChecksum="mlf3vw=="/>
+                  </w:sdtPr>
+                  <w:sdtContent>
+                    <w:tc>
+                      <w:tcPr>
+                        <w:tcW w:w="1925" w:type="dxa"/>
+                      </w:tcPr>
+                      <w:p>
+                        <w:proofErr w:type="spellStart"/>
+                        <w:r>
+                          <w:t>Rental_No</w:t>
+                        </w:r>
+                        <w:proofErr w:type="spellEnd"/>
+                      </w:p>
+                    </w:tc>
+                  </w:sdtContent>
+                </w:sdt>
+                <w:sdt>
+                  <w:sdtPr>
+                    <w:alias w:val="#Nav: /Customer/Rental_Header/Rental_Date"/>
+                    <w:tag w:val="#Nav: Rental_Report/50400"/>
+                    <w:id w:val="1778680718"/>
+                    <w:placeholder>
+                      <w:docPart w:val="DefaultPlaceholder_-1854013440"/>
+                    </w:placeholder>
+                    <w15:dataBinding w:prefixMappings="xmlns:ns0='urn:microsoft-dynamics-nav/reports/Rental_Report/50400/' " w:xpath="/ns0:NavWordReportXmlPart[1]/ns0:Customer[1]/ns0:Rental_Header[1]/ns0:Rental_Date[1]" w:storeItemID="{7776C64D-EAEC-40BA-B934-66B1CD93BA34}" w16sdtdh:storeItemChecksum="mlf3vw=="/>
+                  </w:sdtPr>
+                  <w:sdtContent>
+                    <w:tc>
+                      <w:tcPr>
+                        <w:tcW w:w="1925" w:type="dxa"/>
+                      </w:tcPr>
+                      <w:p>
+                        <w:proofErr w:type="spellStart"/>
+                        <w:r>
+                          <w:t>Rental_Date</w:t>
+                        </w:r>
+                        <w:proofErr w:type="spellEnd"/>
+                      </w:p>
+                    </w:tc>
+                  </w:sdtContent>
+                </w:sdt>
+                <w:sdt>
+                  <w:sdtPr>
+                    <w:alias w:val="#Nav: /Customer/Rental_Header/Expected_Return_Date"/>
+                    <w:tag w:val="#Nav: Rental_Report/50400"/>
+                    <w:id w:val="1678540433"/>
+                    <w:placeholder>
+                      <w:docPart w:val="DefaultPlaceholder_-1854013440"/>
+                    </w:placeholder>
+                    <w15:dataBinding w:prefixMappings="xmlns:ns0='urn:microsoft-dynamics-nav/reports/Rental_Report/50400/' " w:xpath="/ns0:NavWordReportXmlPart[1]/ns0:Customer[1]/ns0:Rental_Header[1]/ns0:Expected_Return_Date[1]" w:storeItemID="{7776C64D-EAEC-40BA-B934-66B1CD93BA34}" w16sdtdh:storeItemChecksum="mlf3vw=="/>
+                  </w:sdtPr>
+                  <w:sdtContent>
+                    <w:tc>
+                      <w:tcPr>
+                        <w:tcW w:w="1926" w:type="dxa"/>
+                      </w:tcPr>
+                      <w:p>
+                        <w:proofErr w:type="spellStart"/>
+                        <w:r>
+                          <w:t>Expected_Return_Date</w:t>
+                        </w:r>
+                        <w:proofErr w:type="spellEnd"/>
+                      </w:p>
+                    </w:tc>
+                  </w:sdtContent>
+                </w:sdt>
+                <w:sdt>
+                  <w:sdtPr>
+                    <w:alias w:val="#Nav: /Customer/Rental_Header/Actual_Return_Date"/>
+                    <w:tag w:val="#Nav: Rental_Report/50400"/>
+                    <w:id w:val="1887374183"/>
+                    <w:placeholder>
+                      <w:docPart w:val="DefaultPlaceholder_-1854013440"/>
+                    </w:placeholder>
+                    <w15:dataBinding w:prefixMappings="xmlns:ns0='urn:microsoft-dynamics-nav/reports/Rental_Report/50400/' " w:xpath="/ns0:NavWordReportXmlPart[1]/ns0:Customer[1]/ns0:Rental_Header[1]/ns0:Actual_Return_Date[1]" w:storeItemID="{7776C64D-EAEC-40BA-B934-66B1CD93BA34}" w16sdtdh:storeItemChecksum="mlf3vw=="/>
+                  </w:sdtPr>
+                  <w:sdtContent>
+                    <w:tc>
+                      <w:tcPr>
+                        <w:tcW w:w="1926" w:type="dxa"/>
+                      </w:tcPr>
+                      <w:p>
+                        <w:proofErr w:type="spellStart"/>
+                        <w:r>
+                          <w:t>Actual_Return_Date</w:t>
+                        </w:r>
+                        <w:proofErr w:type="spellEnd"/>
+                      </w:p>
+                    </w:tc>
+                  </w:sdtContent>
+                </w:sdt>
+                <w:sdt>
+                  <w:sdtPr>
+                    <w:alias w:val="#Nav: /Customer/Rental_Header/Status"/>
+                    <w:tag w:val="#Nav: Rental_Report/50400"/>
+                    <w:id w:val="-94020399"/>
+                    <w:placeholder>
+                      <w:docPart w:val="DefaultPlaceholder_-1854013440"/>
+                    </w:placeholder>
+                    <w15:dataBinding w:prefixMappings="xmlns:ns0='urn:microsoft-dynamics-nav/reports/Rental_Report/50400/' " w:xpath="/ns0:NavWordReportXmlPart[1]/ns0:Customer[1]/ns0:Rental_Header[1]/ns0:Status[1]" w:storeItemID="{7776C64D-EAEC-40BA-B934-66B1CD93BA34}" w16sdtdh:storeItemChecksum="mlf3vw=="/>
+                  </w:sdtPr>
+                  <w:sdtContent>
+                    <w:tc>
+                      <w:tcPr>
+                        <w:tcW w:w="1926" w:type="dxa"/>
+                      </w:tcPr>
+                      <w:p>
+                        <w:r>
+                          <w:t>Status</w:t>
+                        </w:r>
+                      </w:p>
+                    </w:tc>
+                  </w:sdtContent>
+                </w:sdt>
+              </w:tr>
+            </w:sdtContent>
+          </w:sdt>
+        </w:sdtContent>
+      </w:sdt>
+    </w:tbl>
+    <w:p/>
+    <w:tbl>
+      <w:tblPr>
+        <w:tblStyle w:val="Tabelamrea"/>
+        <w:tblW w:w="0" w:type="auto"/>
+        <w:tblLook w:val="04A0" w:firstRow="1" w:lastRow="0" w:firstColumn="1" w:lastColumn="0" w:noHBand="0" w:noVBand="1"/>
+      </w:tblPr>
+      <w:tblGrid>
+        <w:gridCol w:w="1925"/>
+        <w:gridCol w:w="1925"/>
+        <w:gridCol w:w="1926"/>
+        <w:gridCol w:w="1926"/>
+        <w:gridCol w:w="1926"/>
+      </w:tblGrid>
+      <w:tr>
+        <w:tc>
+          <w:tcPr>
+            <w:tcW w:w="1925" w:type="dxa"/>
+          </w:tcPr>
+          <w:p>
+            <w:pPr>
+              <w:rPr>
+                <w:b/>
+                <w:bCs/>
+              </w:rPr>
+            </w:pPr>
+            <w:proofErr w:type="spellStart"/>
+            <w:r>
+              <w:rPr>
+                <w:b/>
+                <w:bCs/>
+              </w:rPr>
+              <w:t>Bicycle</w:t>
+            </w:r>
+            <w:proofErr w:type="spellEnd"/>
+            <w:r>
+              <w:rPr>
+                <w:b/>
+                <w:bCs/>
+              </w:rPr>
+              <w:t xml:space="preserve"> No.</w:t>
+            </w:r>
+          </w:p>
+        </w:tc>
+        <w:tc>
+          <w:tcPr>
+            <w:tcW w:w="1925" w:type="dxa"/>
+          </w:tcPr>
+          <w:p>
+            <w:pPr>
+              <w:rPr>
+                <w:b/>
+                <w:bCs/>
+              </w:rPr>
+            </w:pPr>
+            <w:proofErr w:type="spellStart"/>
+            <w:r>
+              <w:rPr>
+                <w:b/>
+                <w:bCs/>
+              </w:rPr>
+              <w:t>Description</w:t>
+            </w:r>
+            <w:proofErr w:type="spellEnd"/>
+          </w:p>
+        </w:tc>
+        <w:tc>
+          <w:tcPr>
+            <w:tcW w:w="1926" w:type="dxa"/>
+          </w:tcPr>
+          <w:p>
+            <w:pPr>
+              <w:rPr>
+                <w:b/>
+                <w:bCs/>
+              </w:rPr>
+            </w:pPr>
+            <w:proofErr w:type="spellStart"/>
+            <w:r>
+              <w:rPr>
+                <w:b/>
+                <w:bCs/>
+              </w:rPr>
+              <w:t>Rental</w:t>
+            </w:r>
+            <w:proofErr w:type="spellEnd"/>
+            <w:r>
+              <w:rPr>
+                <w:b/>
+                <w:bCs/>
+              </w:rPr>
+              <w:t xml:space="preserve"> </w:t>
+            </w:r>
+            <w:proofErr w:type="spellStart"/>
+            <w:r>
+              <w:rPr>
+                <w:b/>
+                <w:bCs/>
+              </w:rPr>
+              <w:t>Days</w:t>
+            </w:r>
+            <w:proofErr w:type="spellEnd"/>
+          </w:p>
+        </w:tc>
+        <w:tc>
+          <w:tcPr>
+            <w:tcW w:w="1926" w:type="dxa"/>
+          </w:tcPr>
+          <w:p>
+            <w:pPr>
+              <w:rPr>
+                <w:b/>
+                <w:bCs/>
+              </w:rPr>
+            </w:pPr>
+            <w:proofErr w:type="spellStart"/>
+            <w:r>
+              <w:rPr>
+                <w:b/>
+                <w:bCs/>
+              </w:rPr>
+              <w:t>Daily</w:t>
+            </w:r>
+            <w:proofErr w:type="spellEnd"/>
+            <w:r>
+              <w:rPr>
+                <w:b/>
+                <w:bCs/>
+              </w:rPr>
+              <w:t xml:space="preserve"> </w:t>
+            </w:r>
+            <w:proofErr w:type="spellStart"/>
+            <w:r>
+              <w:rPr>
+                <w:b/>
+                <w:bCs/>
+              </w:rPr>
+              <w:t>Rate</w:t>
+            </w:r>
+            <w:proofErr w:type="spellEnd"/>
+          </w:p>
+        </w:tc>
+        <w:tc>
+          <w:tcPr>
+            <w:tcW w:w="1926" w:type="dxa"/>
+          </w:tcPr>
+          <w:p>
+            <w:pPr>
+              <w:rPr>
+                <w:b/>
+                <w:bCs/>
+              </w:rPr>
+            </w:pPr>
+            <w:r>
+              <w:rPr>
+                <w:b/>
+                <w:bCs/>
+              </w:rPr>
+              <w:t xml:space="preserve">Line </w:t>
+            </w:r>
+            <w:proofErr w:type="spellStart"/>
+            <w:r>
+              <w:rPr>
+                <w:b/>
+                <w:bCs/>
+              </w:rPr>
+              <w:t>Amount</w:t>
+            </w:r>
+            <w:proofErr w:type="spellEnd"/>
+          </w:p>
+        </w:tc>
+      </w:tr>
+      <w:sdt>
+        <w:sdtPr>
+          <w:alias w:val="#Nav: /Customer/Rental_Header/Rental_Line"/>
+          <w:tag w:val="#Nav: Rental_Report/50400"/>
+          <w:id w:val="-1509744862"/>
+          <w15:dataBinding w:prefixMappings="xmlns:ns0='urn:microsoft-dynamics-nav/reports/Rental_Report/50400/' " w:xpath="/ns0:NavWordReportXmlPart[1]/ns0:Customer[1]/ns0:Rental_Header[1]/ns0:Rental_Line" w:storeItemID="{7776C64D-EAEC-40BA-B934-66B1CD93BA34}"/>
+          <w15:repeatingSection/>
+        </w:sdtPr>
+        <w:sdtContent>
+          <w:sdt>
+            <w:sdtPr>
+              <w:id w:val="-1850483288"/>
+              <w:placeholder>
+                <w:docPart w:val="DefaultPlaceholder_-1854013435"/>
+              </w:placeholder>
+              <w15:repeatingSectionItem/>
+            </w:sdtPr>
+            <w:sdtContent>
+              <w:tr>
+                <w:sdt>
+                  <w:sdtPr>
+                    <w:alias w:val="#Nav: /Customer/Rental_Header/Rental_Line/Bicycle_No"/>
+                    <w:tag w:val="#Nav: Rental_Report/50400"/>
+                    <w:id w:val="154813976"/>
+                    <w:placeholder>
+                      <w:docPart w:val="DefaultPlaceholder_-1854013440"/>
+                    </w:placeholder>
+                    <w15:dataBinding w:prefixMappings="xmlns:ns0='urn:microsoft-dynamics-nav/reports/Rental_Report/50400/' " w:xpath="/ns0:NavWordReportXmlPart[1]/ns0:Customer[1]/ns0:Rental_Header[1]/ns0:Rental_Line[1]/ns0:Bicycle_No[1]" w:storeItemID="{7776C64D-EAEC-40BA-B934-66B1CD93BA34}" w16sdtdh:storeItemChecksum="mlf3vw=="/>
+                  </w:sdtPr>
+                  <w:sdtContent>
+                    <w:tc>
+                      <w:tcPr>
+                        <w:tcW w:w="1925" w:type="dxa"/>
+                      </w:tcPr>
+                      <w:p>
+                        <w:proofErr w:type="spellStart"/>
+                        <w:r>
+                          <w:t>Bicycle_No</w:t>
+                        </w:r>
+                        <w:proofErr w:type="spellEnd"/>
+                      </w:p>
+                    </w:tc>
+                  </w:sdtContent>
+                </w:sdt>
+                <w:sdt>
+                  <w:sdtPr>
+                    <w:alias w:val="#Nav: /Customer/Rental_Header/Rental_Line/Description"/>
+                    <w:tag w:val="#Nav: Rental_Report/50400"/>
+                    <w:id w:val="-1902057106"/>
+                    <w:placeholder>
+                      <w:docPart w:val="DefaultPlaceholder_-1854013440"/>
+                    </w:placeholder>
+                    <w15:dataBinding w:prefixMappings="xmlns:ns0='urn:microsoft-dynamics-nav/reports/Rental_Report/50400/' " w:xpath="/ns0:NavWordReportXmlPart[1]/ns0:Customer[1]/ns0:Rental_Header[1]/ns0:Rental_Line[1]/ns0:Description[1]" w:storeItemID="{7776C64D-EAEC-40BA-B934-66B1CD93BA34}" w16sdtdh:storeItemChecksum="mlf3vw=="/>
+                  </w:sdtPr>
+                  <w:sdtContent>
+                    <w:tc>
+                      <w:tcPr>
+                        <w:tcW w:w="1925" w:type="dxa"/>
+                      </w:tcPr>
+                      <w:p>
+                        <w:proofErr w:type="spellStart"/>
+                        <w:r>
+                          <w:t>Description</w:t>
+                        </w:r>
+                        <w:proofErr w:type="spellEnd"/>
+                      </w:p>
+                    </w:tc>
+                  </w:sdtContent>
+                </w:sdt>
+                <w:sdt>
+                  <w:sdtPr>
+                    <w:alias w:val="#Nav: /Customer/Rental_Header/Rental_Line/Rental_Days"/>
+                    <w:tag w:val="#Nav: Rental_Report/50400"/>
+                    <w:id w:val="-1098713880"/>
+                    <w:placeholder>
+                      <w:docPart w:val="DefaultPlaceholder_-1854013440"/>
+                    </w:placeholder>
+                    <w15:dataBinding w:prefixMappings="xmlns:ns0='urn:microsoft-dynamics-nav/reports/Rental_Report/50400/' " w:xpath="/ns0:NavWordReportXmlPart[1]/ns0:Customer[1]/ns0:Rental_Header[1]/ns0:Rental_Line[1]/ns0:Rental_Days[1]" w:storeItemID="{7776C64D-EAEC-40BA-B934-66B1CD93BA34}" w16sdtdh:storeItemChecksum="mlf3vw=="/>
+                  </w:sdtPr>
+                  <w:sdtContent>
+                    <w:tc>
+                      <w:tcPr>
+                        <w:tcW w:w="1926" w:type="dxa"/>
+                      </w:tcPr>
+                      <w:p>
+                        <w:proofErr w:type="spellStart"/>
+                        <w:r>
+                          <w:t>Rental_Days</w:t>
+                        </w:r>
+                        <w:proofErr w:type="spellEnd"/>
+                      </w:p>
+                    </w:tc>
+                  </w:sdtContent>
+                </w:sdt>
+                <w:sdt>
+                  <w:sdtPr>
+                    <w:alias w:val="#Nav: /Customer/Rental_Header/Rental_Line/Daily_Rate"/>
+                    <w:tag w:val="#Nav: Rental_Report/50400"/>
+                    <w:id w:val="-14235950"/>
+                    <w:placeholder>
+                      <w:docPart w:val="DefaultPlaceholder_-1854013440"/>
+                    </w:placeholder>
+                    <w15:dataBinding w:prefixMappings="xmlns:ns0='urn:microsoft-dynamics-nav/reports/Rental_Report/50400/' " w:xpath="/ns0:NavWordReportXmlPart[1]/ns0:Customer[1]/ns0:Rental_Header[1]/ns0:Rental_Line[1]/ns0:Daily_Rate[1]" w:storeItemID="{7776C64D-EAEC-40BA-B934-66B1CD93BA34}" w16sdtdh:storeItemChecksum="mlf3vw=="/>
+                  </w:sdtPr>
+                  <w:sdtContent>
+                    <w:tc>
+                      <w:tcPr>
+                        <w:tcW w:w="1926" w:type="dxa"/>
+                      </w:tcPr>
+                      <w:p>
+                        <w:proofErr w:type="spellStart"/>
+                        <w:r>
+                          <w:t>Daily_Rate</w:t>
+                        </w:r>
+                        <w:proofErr w:type="spellEnd"/>
+                      </w:p>
+                    </w:tc>
+                  </w:sdtContent>
+                </w:sdt>
+                <w:sdt>
+                  <w:sdtPr>
+                    <w:alias w:val="#Nav: /Customer/Rental_Header/Rental_Line/Line_Amount"/>
+                    <w:tag w:val="#Nav: Rental_Report/50400"/>
+                    <w:id w:val="-2131540565"/>
+                    <w:placeholder>
+                      <w:docPart w:val="DefaultPlaceholder_-1854013440"/>
+                    </w:placeholder>
+                    <w15:dataBinding w:prefixMappings="xmlns:ns0='urn:microsoft-dynamics-nav/reports/Rental_Report/50400/' " w:xpath="/ns0:NavWordReportXmlPart[1]/ns0:Customer[1]/ns0:Rental_Header[1]/ns0:Rental_Line[1]/ns0:Line_Amount[1]" w:storeItemID="{7776C64D-EAEC-40BA-B934-66B1CD93BA34}" w16sdtdh:storeItemChecksum="mlf3vw=="/>
+                  </w:sdtPr>
+                  <w:sdtContent>
+                    <w:tc>
+                      <w:tcPr>
+                        <w:tcW w:w="1926" w:type="dxa"/>
+                      </w:tcPr>
+                      <w:p>
+                        <w:proofErr w:type="spellStart"/>
+                        <w:r>
+                          <w:t>Line_Amount</w:t>
+                        </w:r>
+                        <w:proofErr w:type="spellEnd"/>
+                      </w:p>
+                    </w:tc>
+                  </w:sdtContent>
+                </w:sdt>
+              </w:tr>
+            </w:sdtContent>
+          </w:sdt>
+        </w:sdtContent>
+      </w:sdt>
+    </w:tbl>
+    <w:p/>
     <w:sectPr>
       <w:pgSz w:w="11906" w:h="16838"/>
       <w:pgMar w:top="1701" w:right="1134" w:bottom="1701" w:left="1134" w:header="708" w:footer="708" w:gutter="0"/>
@@ -466,6 +1312,25 @@
       <w:color w:val="666666"/>
     </w:rPr>
   </w:style>
+  <w:style w:type="table" w:styleId="Tabelamrea">
+    <w:name w:val="Table Grid"/>
+    <w:basedOn w:val="Navadnatabela"/>
+    <w:uiPriority w:val="39"/>
+    <w:rsid w:val="005C663B"/>
+    <w:pPr>
+      <w:spacing w:after="0" w:line="240" w:lineRule="auto"/>
+    </w:pPr>
+    <w:tblPr>
+      <w:tblBorders>
+        <w:top w:val="single" w:sz="4" w:space="0" w:color="auto"/>
+        <w:left w:val="single" w:sz="4" w:space="0" w:color="auto"/>
+        <w:bottom w:val="single" w:sz="4" w:space="0" w:color="auto"/>
+        <w:right w:val="single" w:sz="4" w:space="0" w:color="auto"/>
+        <w:insideH w:val="single" w:sz="4" w:space="0" w:color="auto"/>
+        <w:insideV w:val="single" w:sz="4" w:space="0" w:color="auto"/>
+      </w:tblBorders>
+    </w:tblPr>
+  </w:style>
 </w:styles>
 </file>
 
@@ -494,6 +1359,32 @@
               <w:rStyle w:val="Besedilooznabemesta"/>
             </w:rPr>
             <w:t>Kliknite ali tapnite tukaj, če želite vnesti besedilo.</w:t>
+          </w:r>
+        </w:p>
+      </w:docPartBody>
+    </w:docPart>
+    <w:docPart>
+      <w:docPartPr>
+        <w:name w:val="DefaultPlaceholder_-1854013435"/>
+        <w:category>
+          <w:name w:val="Splošno"/>
+          <w:gallery w:val="placeholder"/>
+        </w:category>
+        <w:types>
+          <w:type w:val="bbPlcHdr"/>
+        </w:types>
+        <w:behaviors>
+          <w:behavior w:val="content"/>
+        </w:behaviors>
+        <w:guid w:val="{B34391EF-D339-4904-B9AF-DAC59CCDABAF}"/>
+      </w:docPartPr>
+      <w:docPartBody>
+        <w:p>
+          <w:r>
+            <w:rPr>
+              <w:rStyle w:val="Besedilooznabemesta"/>
+            </w:rPr>
+            <w:t>Vnesite poljubno vsebino, ki jo želite ponoviti, vključno z drugimi kontrolniki vsebine. Če želite ponoviti dele tabele, lahko ta kontrolnik vstavite tudi okoli vrstic tabele.</w:t>
           </w:r>
         </w:p>
       </w:docPartBody>
@@ -543,9 +1434,16 @@
   </w:compat>
   <w:rsids>
     <w:rsidRoot w:val="0036762A"/>
+    <w:rsid w:val="00364982"/>
     <w:rsid w:val="0036762A"/>
     <w:rsid w:val="003B7346"/>
+    <w:rsid w:val="003F788F"/>
+    <w:rsid w:val="00422C0D"/>
+    <w:rsid w:val="005140FF"/>
+    <w:rsid w:val="006C23DF"/>
+    <w:rsid w:val="00A911B3"/>
     <w:rsid w:val="00E93D23"/>
+    <w:rsid w:val="00F721BC"/>
   </w:rsids>
   <m:mathPr>
     <m:mathFont m:val="Cambria Math"/>
@@ -1001,7 +1899,7 @@
     <w:basedOn w:val="Privzetapisavaodstavka"/>
     <w:uiPriority w:val="99"/>
     <w:semiHidden/>
-    <w:rsid w:val="0036762A"/>
+    <w:rsid w:val="00A911B3"/>
     <w:rPr>
       <w:color w:val="666666"/>
     </w:rPr>
@@ -1409,6 +2307,8 @@
  
      < C u s t o m e r >   
+         < C u r r e n t D a t e > C u r r e n t D a t e < / C u r r e n t D a t e > + 
          < C u s t o m e r _ N o > C u s t o m e r _ N o < / C u s t o m e r _ N o >   
          < N a m e > N a m e < / N a m e > @@ -1446,9 +2346,7 @@
  < / N a v W o r d R e p o r t X m l P a r t > 
 </file>
 
-<file path=customXml/item2.xml>��< ? x m l   v e r s i o n = " 1 . 0 "   e n c o d i n g = " u t f - 1 6 " ? > - 
- < N a v W o r d R e p o r t X m l P a r t   x m l n s = " u r n : m i c r o s o f t - d y n a m i c s - b u s i n e s s c e n t r a l / i n t e r n a l / e x t e n d e d / r e p o r t s / R e n t a l _ R e p o r t / 5 0 4 0 0 / " > +<file path=customXml/item2.xml>��< ? x m l   v e r s i o n = " 1 . 0 "   e n c o d i n g = " u t f - 1 6 " ? > < N a v W o r d R e p o r t X m l P a r t   x m l n s = " u r n : m i c r o s o f t - d y n a m i c s - b u s i n e s s c e n t r a l / i n t e r n a l / e x t e n d e d / r e p o r t s / R e n t a l _ R e p o r t / 5 0 4 0 0 / " >   
      < B C R e p o r t I n f o r m a t i o n >   
@@ -1559,6 +2457,8 @@
      < / T o o l t i p s >   
      < C u s t o m e r   E l e m e n t T y p e = " D a t a I t e m "   E l e m e n t I d = " 1 5 2 5 1 9 1 9 9 " > + 
+         < C u r r e n t D a t e   E l e m e n t T y p e = " C o l u m n "   E l e m e n t I d = " 1 2 5 5 0 0 7 4 4 0 "   D a t a T y p e = " D a t e " > C u r r e n t D a t e < / C u r r e n t D a t e >   
          < C u s t o m e r _ N o   E l e m e n t T y p e = " C o l u m n "   E l e m e n t I d = " 1 2 8 3 5 9 6 7 7 5 "   D a t a T y p e = " C o d e " > C u s t o m e r _ N o < / C u s t o m e r _ N o >   

</xml_diff>